<commit_message>
UPDATE: modify docs chapter title
</commit_message>
<xml_diff>
--- a/docs/fusioncompute_ansible_module_cleaned.docx
+++ b/docs/fusioncompute_ansible_module_cleaned.docx
@@ -20,7 +20,13 @@
       <w:bookmarkEnd w:id="2"/>
       <w:bookmarkEnd w:id="3"/>
       <w:r>
-        <w:t xml:space="preserve">FusionCompute Ansible </w:t>
+        <w:t>FusionCompute Ansibl</w:t>
+      </w:r>
+      <w:r>
+        <w:t>e</w:t>
+      </w:r>
+      <w:r>
+        <w:t xml:space="preserve"> </w:t>
       </w:r>
       <w:r>
         <w:t>模块</w:t>
@@ -1148,7 +1154,7 @@
         </w:rPr>
       </w:pPr>
       <w:r>
-        <w:pict w14:anchorId="6B45A0F6">
+        <w:pict w14:anchorId="5853E9A8">
           <v:shapetype id="_x0000_t75" coordsize="21600,21600" o:spt="75" o:preferrelative="t" path="m@4@5l@4@11@9@11@9@5xe" filled="f" stroked="f">
             <v:stroke joinstyle="miter"/>
             <v:formulas>
@@ -1168,7 +1174,7 @@
             <v:path o:extrusionok="f" gradientshapeok="t" o:connecttype="rect"/>
             <o:lock v:ext="edit" aspectratio="t"/>
           </v:shapetype>
-          <v:shape id="_x0000_i1028" type="#_x0000_t75" style="width:50.15pt;height:18.7pt;visibility:visible;mso-wrap-style:square">
+          <v:shape id="_x0000_i1028" type="#_x0000_t75" style="width:50.15pt;height:19.15pt;visibility:visible;mso-wrap-style:square">
             <v:imagedata r:id="rId7" o:title=""/>
             <o:lock v:ext="edit" rotation="t" cropping="t" verticies="t"/>
           </v:shape>
@@ -1210,8 +1216,8 @@
         </w:rPr>
       </w:pPr>
       <w:r>
-        <w:pict w14:anchorId="5A6DDE16">
-          <v:shape id="图片 4" o:spid="_x0000_i1027" type="#_x0000_t75" style="width:50.15pt;height:18.7pt;visibility:visible;mso-wrap-style:square">
+        <w:pict w14:anchorId="60234433">
+          <v:shape id="图片 4" o:spid="_x0000_i1027" type="#_x0000_t75" style="width:50.15pt;height:19.15pt;visibility:visible;mso-wrap-style:square">
             <v:imagedata r:id="rId8" o:title=""/>
             <o:lock v:ext="edit" rotation="t" cropping="t" verticies="t"/>
           </v:shape>
@@ -1838,8 +1844,8 @@
         </w:rPr>
       </w:pPr>
       <w:r>
-        <w:pict w14:anchorId="0D5C5ABE">
-          <v:shape id="图片 2" o:spid="_x0000_i1026" type="#_x0000_t75" style="width:50.15pt;height:18.7pt;visibility:visible;mso-wrap-style:square">
+        <w:pict w14:anchorId="1FE513BE">
+          <v:shape id="图片 2" o:spid="_x0000_i1026" type="#_x0000_t75" style="width:50.15pt;height:19.15pt;visibility:visible;mso-wrap-style:square">
             <v:imagedata r:id="rId7" o:title=""/>
             <o:lock v:ext="edit" rotation="t" cropping="t" verticies="t"/>
           </v:shape>
@@ -2870,8 +2876,8 @@
         </w:rPr>
       </w:pPr>
       <w:r>
-        <w:pict w14:anchorId="333B6F50">
-          <v:shape id="图片 1" o:spid="_x0000_i1025" type="#_x0000_t75" style="width:50.15pt;height:18.7pt;visibility:visible;mso-wrap-style:square">
+        <w:pict w14:anchorId="037AD1E3">
+          <v:shape id="图片 1" o:spid="_x0000_i1025" type="#_x0000_t75" style="width:50.15pt;height:19.15pt;visibility:visible;mso-wrap-style:square">
             <v:imagedata r:id="rId7" o:title=""/>
             <o:lock v:ext="edit" rotation="t" cropping="t" verticies="t"/>
           </v:shape>
@@ -10889,6 +10895,9 @@
         <w:t>laybook</w:t>
       </w:r>
       <w:r>
+        <w:t xml:space="preserve"> </w:t>
+      </w:r>
+      <w:r>
         <w:t>示例</w:t>
       </w:r>
       <w:bookmarkEnd w:id="6"/>
@@ -12974,6 +12983,9 @@
               <w:widowControl w:val="0"/>
               <w:ind w:left="0"/>
               <w:jc w:val="both"/>
+              <w:rPr>
+                <w:rFonts w:hint="default"/>
+              </w:rPr>
             </w:pPr>
             <w:r>
               <w:rPr>
@@ -12985,7 +12997,13 @@
         </w:tc>
       </w:tr>
     </w:tbl>
-    <w:p/>
+    <w:p>
+      <w:pPr>
+        <w:rPr>
+          <w:rFonts w:hint="default"/>
+        </w:rPr>
+      </w:pPr>
+    </w:p>
     <w:p>
       <w:pPr>
         <w:rPr>
@@ -17812,6 +17830,9 @@
               <w:widowControl w:val="0"/>
               <w:ind w:left="0"/>
               <w:jc w:val="both"/>
+              <w:rPr>
+                <w:rFonts w:hint="default"/>
+              </w:rPr>
             </w:pPr>
             <w:r>
               <w:rPr>
@@ -17848,13 +17869,7 @@
         <w:rPr>
           <w:lang w:eastAsia="zh-CN"/>
         </w:rPr>
-        <w:t>运行</w:t>
-      </w:r>
-      <w:r>
-        <w:rPr>
-          <w:lang w:eastAsia="zh-CN"/>
-        </w:rPr>
-        <w:t>示例</w:t>
+        <w:t>运行示例</w:t>
       </w:r>
     </w:p>
     <w:tbl>
@@ -31911,6 +31926,9 @@
               <w:widowControl w:val="0"/>
               <w:ind w:left="0"/>
               <w:jc w:val="both"/>
+              <w:rPr>
+                <w:rFonts w:hint="default"/>
+              </w:rPr>
             </w:pPr>
             <w:r>
               <w:rPr>
@@ -31922,7 +31940,13 @@
         </w:tc>
       </w:tr>
     </w:tbl>
-    <w:p/>
+    <w:p>
+      <w:pPr>
+        <w:rPr>
+          <w:rFonts w:hint="default"/>
+        </w:rPr>
+      </w:pPr>
+    </w:p>
     <w:sectPr>
       <w:headerReference w:type="even" r:id="rId9"/>
       <w:headerReference w:type="default" r:id="rId10"/>
@@ -32592,7 +32616,7 @@
                 <w:rFonts w:hint="default"/>
                 <w:noProof/>
               </w:rPr>
-              <w:t xml:space="preserve">2 </w:t>
+              <w:t xml:space="preserve">1 </w:t>
             </w:r>
           </w:fldSimple>
           <w:fldSimple w:instr=" STYLEREF  &quot;1&quot;  ">
@@ -32600,13 +32624,13 @@
               <w:rPr>
                 <w:noProof/>
               </w:rPr>
-              <w:t>Ansible Playbook</w:t>
+              <w:t xml:space="preserve">FusionCompute Ansible </w:t>
             </w:r>
             <w:r>
               <w:rPr>
                 <w:noProof/>
               </w:rPr>
-              <w:t>示例</w:t>
+              <w:t>模块</w:t>
             </w:r>
           </w:fldSimple>
         </w:p>

</xml_diff>

<commit_message>
UPDATE: ansible agent v2
</commit_message>
<xml_diff>
--- a/docs/fusioncompute_ansible_module_cleaned.docx
+++ b/docs/fusioncompute_ansible_module_cleaned.docx
@@ -60,7 +60,10 @@
         <w:t>和</w:t>
       </w:r>
       <w:r>
-        <w:t>site ID</w:t>
+        <w:t>S</w:t>
+      </w:r>
+      <w:r>
+        <w:t>ite ID</w:t>
       </w:r>
       <w:r>
         <w:t>。</w:t>
@@ -75,18 +78,13 @@
         <w:t xml:space="preserve"> API </w:t>
       </w:r>
       <w:r>
-        <w:t>支持三种鉴权方式：</w:t>
+        <w:t>支持传入接口用户和密码</w:t>
       </w:r>
-    </w:p>
-    <w:p>
-      <w:pPr>
-        <w:pStyle w:val="ItemList"/>
-        <w:rPr>
-          <w:rFonts w:hint="default"/>
-        </w:rPr>
-      </w:pPr>
       <w:r>
-        <w:t>传入接口用户和密码：如果仅传入用户名和密码，</w:t>
+        <w:t>进行鉴权</w:t>
+      </w:r>
+      <w:r>
+        <w:t>，</w:t>
       </w:r>
       <w:r>
         <w:t xml:space="preserve">Ansible </w:t>
@@ -109,1139 +107,80 @@
     </w:p>
     <w:p>
       <w:pPr>
-        <w:pStyle w:val="ItemList"/>
         <w:rPr>
           <w:rFonts w:hint="default"/>
         </w:rPr>
       </w:pPr>
       <w:r>
-        <w:t>传入</w:t>
+        <w:t>实例鉴权例子</w:t>
       </w:r>
       <w:r>
-        <w:t xml:space="preserve"> Token</w:t>
+        <w:t>请参考</w:t>
       </w:r>
       <w:r>
-        <w:t>：如果只传入</w:t>
+        <w:t>章节</w:t>
       </w:r>
       <w:r>
-        <w:t xml:space="preserve"> Token</w:t>
+        <w:t>“</w:t>
       </w:r>
       <w:r>
-        <w:t>，</w:t>
+        <w:t>2</w:t>
       </w:r>
       <w:r>
-        <w:t xml:space="preserve">Ansible </w:t>
+        <w:rPr>
+          <w:rFonts w:hint="default"/>
+        </w:rPr>
+        <w:t>.1 Ansible Playbook</w:t>
       </w:r>
       <w:r>
-        <w:t>会直接使用该</w:t>
+        <w:t>代码</w:t>
       </w:r>
       <w:r>
-        <w:t xml:space="preserve"> Token </w:t>
+        <w:t>示例”中代码文件</w:t>
       </w:r>
       <w:r>
-        <w:t>进行认证，不会尝试重新获取。</w:t>
+        <w:t>main</w:t>
+      </w:r>
+      <w:r>
+        <w:rPr>
+          <w:rFonts w:hint="default"/>
+        </w:rPr>
+        <w:t>.yml</w:t>
+      </w:r>
+      <w:r>
+        <w:t>中的“</w:t>
+      </w:r>
+      <w:r>
+        <w:rPr>
+          <w:rFonts w:hint="default"/>
+        </w:rPr>
+        <w:t># TASK 1 - Inherit Module - Login Test</w:t>
+      </w:r>
+      <w:r>
+        <w:t>”部分。</w:t>
       </w:r>
     </w:p>
     <w:p>
-      <w:pPr>
-        <w:pStyle w:val="ItemList"/>
-        <w:rPr>
-          <w:rFonts w:hint="default"/>
-        </w:rPr>
-      </w:pPr>
       <w:r>
-        <w:t>传入</w:t>
+        <w:t>注意：在调用其他模块的时候，会自动进行鉴权。除非用户想显示获取</w:t>
       </w:r>
       <w:r>
-        <w:t xml:space="preserve"> Token </w:t>
+        <w:t>TOKEN</w:t>
       </w:r>
       <w:r>
-        <w:t>和用户名密码：如果同时传入</w:t>
+        <w:t>信息，无需在</w:t>
       </w:r>
       <w:r>
-        <w:t xml:space="preserve"> Token </w:t>
+        <w:t>Ansible Playbook</w:t>
       </w:r>
       <w:r>
-        <w:t>和用户名密码，</w:t>
+        <w:t>中调用</w:t>
       </w:r>
       <w:r>
-        <w:t xml:space="preserve">Ansible </w:t>
-      </w:r>
-      <w:r>
-        <w:t>会优先使用</w:t>
-      </w:r>
-      <w:r>
-        <w:t xml:space="preserve"> Token</w:t>
-      </w:r>
-      <w:r>
-        <w:t>，如果</w:t>
-      </w:r>
-      <w:r>
-        <w:t xml:space="preserve"> Token </w:t>
-      </w:r>
-      <w:r>
-        <w:t>过期，系统会自动重新获取</w:t>
-      </w:r>
-      <w:r>
-        <w:t xml:space="preserve"> Token</w:t>
+        <w:t>模块鉴权</w:t>
       </w:r>
       <w:r>
         <w:t>。</w:t>
-      </w:r>
-    </w:p>
-    <w:p>
-      <w:pPr>
-        <w:rPr>
-          <w:rFonts w:hint="default"/>
-        </w:rPr>
-      </w:pPr>
-      <w:r>
-        <w:t>实例鉴权例子如下所示：</w:t>
-      </w:r>
-    </w:p>
-    <w:tbl>
-      <w:tblPr>
-        <w:tblW w:w="0" w:type="auto"/>
-        <w:tblInd w:w="1701" w:type="dxa"/>
-        <w:tblBorders>
-          <w:top w:val="single" w:sz="4" w:space="0" w:color="auto"/>
-          <w:left w:val="single" w:sz="4" w:space="0" w:color="auto"/>
-          <w:bottom w:val="single" w:sz="4" w:space="0" w:color="auto"/>
-          <w:right w:val="single" w:sz="4" w:space="0" w:color="auto"/>
-          <w:insideH w:val="single" w:sz="4" w:space="0" w:color="auto"/>
-          <w:insideV w:val="single" w:sz="4" w:space="0" w:color="auto"/>
-        </w:tblBorders>
-        <w:tblLook w:val="04A0" w:firstRow="1" w:lastRow="0" w:firstColumn="1" w:lastColumn="0" w:noHBand="0" w:noVBand="1"/>
-      </w:tblPr>
-      <w:tblGrid>
-        <w:gridCol w:w="8154"/>
-      </w:tblGrid>
-      <w:tr>
-        <w:tc>
-          <w:tcPr>
-            <w:tcW w:w="9855" w:type="dxa"/>
-          </w:tcPr>
-          <w:p>
-            <w:pPr>
-              <w:widowControl w:val="0"/>
-              <w:ind w:left="0"/>
-              <w:jc w:val="both"/>
-              <w:rPr>
-                <w:rFonts w:hint="default"/>
-              </w:rPr>
-            </w:pPr>
-            <w:r>
-              <w:rPr>
-                <w:rFonts w:hint="default"/>
-              </w:rPr>
-              <w:t>- name: Test login</w:t>
-            </w:r>
-          </w:p>
-          <w:p>
-            <w:pPr>
-              <w:widowControl w:val="0"/>
-              <w:ind w:left="0"/>
-              <w:jc w:val="both"/>
-              <w:rPr>
-                <w:rFonts w:hint="default"/>
-              </w:rPr>
-            </w:pPr>
-            <w:r>
-              <w:rPr>
-                <w:rFonts w:hint="default"/>
-              </w:rPr>
-              <w:t xml:space="preserve">  hosts: localhost</w:t>
-            </w:r>
-          </w:p>
-          <w:p>
-            <w:pPr>
-              <w:widowControl w:val="0"/>
-              <w:ind w:left="0"/>
-              <w:jc w:val="both"/>
-              <w:rPr>
-                <w:rFonts w:hint="default"/>
-              </w:rPr>
-            </w:pPr>
-            <w:r>
-              <w:rPr>
-                <w:rFonts w:hint="default"/>
-              </w:rPr>
-              <w:t xml:space="preserve">  vars_files:</w:t>
-            </w:r>
-          </w:p>
-          <w:p>
-            <w:pPr>
-              <w:widowControl w:val="0"/>
-              <w:ind w:left="0"/>
-              <w:jc w:val="both"/>
-              <w:rPr>
-                <w:rFonts w:hint="default"/>
-              </w:rPr>
-            </w:pPr>
-            <w:r>
-              <w:rPr>
-                <w:rFonts w:hint="default"/>
-              </w:rPr>
-              <w:t xml:space="preserve">    - ./commons.yml</w:t>
-            </w:r>
-          </w:p>
-          <w:p>
-            <w:pPr>
-              <w:widowControl w:val="0"/>
-              <w:ind w:left="0"/>
-              <w:jc w:val="both"/>
-              <w:rPr>
-                <w:rFonts w:hint="default"/>
-              </w:rPr>
-            </w:pPr>
-            <w:r>
-              <w:rPr>
-                <w:rFonts w:hint="default"/>
-              </w:rPr>
-              <w:t xml:space="preserve">  tasks:</w:t>
-            </w:r>
-          </w:p>
-          <w:p>
-            <w:pPr>
-              <w:widowControl w:val="0"/>
-              <w:ind w:left="0"/>
-              <w:jc w:val="both"/>
-              <w:rPr>
-                <w:rFonts w:hint="default"/>
-              </w:rPr>
-            </w:pPr>
-            <w:r>
-              <w:rPr>
-                <w:rFonts w:hint="default"/>
-              </w:rPr>
-              <w:t xml:space="preserve">    - name: Get auth token and site ID</w:t>
-            </w:r>
-          </w:p>
-          <w:p>
-            <w:pPr>
-              <w:widowControl w:val="0"/>
-              <w:ind w:left="0"/>
-              <w:jc w:val="both"/>
-              <w:rPr>
-                <w:rFonts w:hint="default"/>
-              </w:rPr>
-            </w:pPr>
-            <w:r>
-              <w:rPr>
-                <w:rFonts w:hint="default"/>
-              </w:rPr>
-              <w:t xml:space="preserve">      huawei.fusioncompute.fc_token_manager:</w:t>
-            </w:r>
-          </w:p>
-          <w:p>
-            <w:pPr>
-              <w:widowControl w:val="0"/>
-              <w:ind w:left="0"/>
-              <w:jc w:val="both"/>
-              <w:rPr>
-                <w:rFonts w:hint="default"/>
-              </w:rPr>
-            </w:pPr>
-            <w:r>
-              <w:rPr>
-                <w:rFonts w:hint="default"/>
-              </w:rPr>
-              <w:t xml:space="preserve">        fc_hostname: '{{ fc_hostname }}'</w:t>
-            </w:r>
-          </w:p>
-          <w:p>
-            <w:pPr>
-              <w:widowControl w:val="0"/>
-              <w:ind w:left="0"/>
-              <w:jc w:val="both"/>
-              <w:rPr>
-                <w:rFonts w:hint="default"/>
-              </w:rPr>
-            </w:pPr>
-            <w:r>
-              <w:rPr>
-                <w:rFonts w:hint="default"/>
-              </w:rPr>
-              <w:t xml:space="preserve">        fc_username: '{{ fc_username }}'</w:t>
-            </w:r>
-          </w:p>
-          <w:p>
-            <w:pPr>
-              <w:widowControl w:val="0"/>
-              <w:ind w:left="0"/>
-              <w:jc w:val="both"/>
-              <w:rPr>
-                <w:rFonts w:hint="default"/>
-              </w:rPr>
-            </w:pPr>
-            <w:r>
-              <w:rPr>
-                <w:rFonts w:hint="default"/>
-              </w:rPr>
-              <w:t xml:space="preserve">        fc_password: '{{ fc_password }}'</w:t>
-            </w:r>
-          </w:p>
-          <w:p>
-            <w:pPr>
-              <w:widowControl w:val="0"/>
-              <w:ind w:left="0"/>
-              <w:jc w:val="both"/>
-              <w:rPr>
-                <w:rFonts w:hint="default"/>
-              </w:rPr>
-            </w:pPr>
-            <w:r>
-              <w:rPr>
-                <w:rFonts w:hint="default"/>
-              </w:rPr>
-              <w:t xml:space="preserve">        action: 'login'</w:t>
-            </w:r>
-          </w:p>
-          <w:p>
-            <w:pPr>
-              <w:widowControl w:val="0"/>
-              <w:ind w:left="0"/>
-              <w:jc w:val="both"/>
-              <w:rPr>
-                <w:rFonts w:hint="default"/>
-              </w:rPr>
-            </w:pPr>
-            <w:r>
-              <w:rPr>
-                <w:rFonts w:hint="default"/>
-              </w:rPr>
-              <w:t xml:space="preserve">      register: output</w:t>
-            </w:r>
-          </w:p>
-          <w:p>
-            <w:pPr>
-              <w:widowControl w:val="0"/>
-              <w:ind w:left="0"/>
-              <w:jc w:val="both"/>
-              <w:rPr>
-                <w:rFonts w:hint="default"/>
-              </w:rPr>
-            </w:pPr>
-          </w:p>
-          <w:p>
-            <w:pPr>
-              <w:widowControl w:val="0"/>
-              <w:ind w:left="0"/>
-              <w:jc w:val="both"/>
-              <w:rPr>
-                <w:rFonts w:hint="default"/>
-              </w:rPr>
-            </w:pPr>
-            <w:r>
-              <w:rPr>
-                <w:rFonts w:hint="default"/>
-              </w:rPr>
-              <w:t xml:space="preserve">    - name: Set fc_token and fc_site_id</w:t>
-            </w:r>
-          </w:p>
-          <w:p>
-            <w:pPr>
-              <w:widowControl w:val="0"/>
-              <w:ind w:left="0"/>
-              <w:jc w:val="both"/>
-              <w:rPr>
-                <w:rFonts w:hint="default"/>
-              </w:rPr>
-            </w:pPr>
-            <w:r>
-              <w:rPr>
-                <w:rFonts w:hint="default"/>
-              </w:rPr>
-              <w:lastRenderedPageBreak/>
-              <w:t xml:space="preserve">      set_fact:</w:t>
-            </w:r>
-          </w:p>
-          <w:p>
-            <w:pPr>
-              <w:widowControl w:val="0"/>
-              <w:ind w:left="0"/>
-              <w:jc w:val="both"/>
-              <w:rPr>
-                <w:rFonts w:hint="default"/>
-              </w:rPr>
-            </w:pPr>
-            <w:r>
-              <w:rPr>
-                <w:rFonts w:hint="default"/>
-              </w:rPr>
-              <w:t xml:space="preserve">        fc_token: "{{ output.ret['fc_token'] }}"</w:t>
-            </w:r>
-          </w:p>
-          <w:p>
-            <w:pPr>
-              <w:widowControl w:val="0"/>
-              <w:ind w:left="0"/>
-              <w:jc w:val="both"/>
-              <w:rPr>
-                <w:rFonts w:hint="default"/>
-              </w:rPr>
-            </w:pPr>
-            <w:r>
-              <w:rPr>
-                <w:rFonts w:hint="default"/>
-              </w:rPr>
-              <w:t xml:space="preserve">        fc_site_id: "{{ output.ret['fc_site_id'] }}"</w:t>
-            </w:r>
-          </w:p>
-          <w:p>
-            <w:pPr>
-              <w:widowControl w:val="0"/>
-              <w:ind w:left="0"/>
-              <w:jc w:val="both"/>
-              <w:rPr>
-                <w:rFonts w:hint="default"/>
-              </w:rPr>
-            </w:pPr>
-          </w:p>
-          <w:p>
-            <w:pPr>
-              <w:widowControl w:val="0"/>
-              <w:ind w:left="0"/>
-              <w:jc w:val="both"/>
-              <w:rPr>
-                <w:rFonts w:hint="default"/>
-              </w:rPr>
-            </w:pPr>
-            <w:r>
-              <w:rPr>
-                <w:rFonts w:hint="default"/>
-              </w:rPr>
-              <w:t xml:space="preserve">    - name: Dump test output</w:t>
-            </w:r>
-          </w:p>
-          <w:p>
-            <w:pPr>
-              <w:widowControl w:val="0"/>
-              <w:ind w:left="0"/>
-              <w:jc w:val="both"/>
-              <w:rPr>
-                <w:rFonts w:hint="default"/>
-              </w:rPr>
-            </w:pPr>
-            <w:r>
-              <w:rPr>
-                <w:rFonts w:hint="default"/>
-              </w:rPr>
-              <w:t xml:space="preserve">      debug:</w:t>
-            </w:r>
-          </w:p>
-          <w:p>
-            <w:pPr>
-              <w:widowControl w:val="0"/>
-              <w:ind w:left="0"/>
-              <w:jc w:val="both"/>
-              <w:rPr>
-                <w:rFonts w:hint="default"/>
-              </w:rPr>
-            </w:pPr>
-            <w:r>
-              <w:rPr>
-                <w:rFonts w:hint="default"/>
-              </w:rPr>
-              <w:t xml:space="preserve">        msg: "{{ fc_token }}"</w:t>
-            </w:r>
-          </w:p>
-          <w:p>
-            <w:pPr>
-              <w:widowControl w:val="0"/>
-              <w:ind w:left="0"/>
-              <w:jc w:val="both"/>
-              <w:rPr>
-                <w:rFonts w:hint="default"/>
-              </w:rPr>
-            </w:pPr>
-          </w:p>
-          <w:p>
-            <w:pPr>
-              <w:widowControl w:val="0"/>
-              <w:ind w:left="0"/>
-              <w:jc w:val="both"/>
-              <w:rPr>
-                <w:rFonts w:hint="default"/>
-              </w:rPr>
-            </w:pPr>
-            <w:r>
-              <w:rPr>
-                <w:rFonts w:hint="default"/>
-              </w:rPr>
-              <w:t xml:space="preserve">    - name: Assert token length</w:t>
-            </w:r>
-          </w:p>
-          <w:p>
-            <w:pPr>
-              <w:widowControl w:val="0"/>
-              <w:ind w:left="0"/>
-              <w:jc w:val="both"/>
-              <w:rPr>
-                <w:rFonts w:hint="default"/>
-              </w:rPr>
-            </w:pPr>
-            <w:r>
-              <w:rPr>
-                <w:rFonts w:hint="default"/>
-              </w:rPr>
-              <w:t xml:space="preserve">      assert:</w:t>
-            </w:r>
-          </w:p>
-          <w:p>
-            <w:pPr>
-              <w:widowControl w:val="0"/>
-              <w:ind w:left="0"/>
-              <w:jc w:val="both"/>
-              <w:rPr>
-                <w:rFonts w:hint="default"/>
-              </w:rPr>
-            </w:pPr>
-            <w:r>
-              <w:rPr>
-                <w:rFonts w:hint="default"/>
-              </w:rPr>
-              <w:t xml:space="preserve">        that:</w:t>
-            </w:r>
-          </w:p>
-          <w:p>
-            <w:pPr>
-              <w:widowControl w:val="0"/>
-              <w:ind w:left="0"/>
-              <w:jc w:val="both"/>
-              <w:rPr>
-                <w:rFonts w:hint="default"/>
-              </w:rPr>
-            </w:pPr>
-            <w:r>
-              <w:rPr>
-                <w:rFonts w:hint="default"/>
-              </w:rPr>
-              <w:t xml:space="preserve">          - fc_token | length &gt; 20</w:t>
-            </w:r>
-          </w:p>
-          <w:p>
-            <w:pPr>
-              <w:widowControl w:val="0"/>
-              <w:ind w:left="0"/>
-              <w:jc w:val="both"/>
-              <w:rPr>
-                <w:rFonts w:hint="default"/>
-              </w:rPr>
-            </w:pPr>
-            <w:r>
-              <w:rPr>
-                <w:rFonts w:hint="default"/>
-              </w:rPr>
-              <w:t xml:space="preserve">        success_msg: "Got auth token!"</w:t>
-            </w:r>
-          </w:p>
-          <w:p>
-            <w:pPr>
-              <w:widowControl w:val="0"/>
-              <w:ind w:left="0"/>
-              <w:jc w:val="both"/>
-              <w:rPr>
-                <w:rFonts w:hint="default"/>
-              </w:rPr>
-            </w:pPr>
-            <w:r>
-              <w:rPr>
-                <w:rFonts w:hint="default"/>
-              </w:rPr>
-              <w:t xml:space="preserve">        fail_msg: "No auth token!"</w:t>
-            </w:r>
-          </w:p>
-        </w:tc>
-      </w:tr>
-    </w:tbl>
-    <w:p>
-      <w:pPr>
-        <w:rPr>
-          <w:rFonts w:hint="default"/>
-        </w:rPr>
-      </w:pPr>
-    </w:p>
-    <w:p>
-      <w:pPr>
-        <w:rPr>
-          <w:rFonts w:hint="default"/>
-        </w:rPr>
-      </w:pPr>
-      <w:r>
-        <w:t>我们可以借助环境变量实现数据注入：所有的接口用户，密码，</w:t>
-      </w:r>
-      <w:r>
-        <w:t>Token</w:t>
-      </w:r>
-      <w:r>
-        <w:t>，</w:t>
-      </w:r>
-      <w:r>
-        <w:t>IP</w:t>
-      </w:r>
-      <w:r>
-        <w:t>，端口，语言，证书路径都可以使用环境变量填充。</w:t>
-      </w:r>
-    </w:p>
-    <w:p>
-      <w:pPr>
-        <w:rPr>
-          <w:rFonts w:hint="default"/>
-        </w:rPr>
-      </w:pPr>
-      <w:r>
-        <w:t>此外，我们可以通过预制的</w:t>
-      </w:r>
-      <w:r>
-        <w:t>fc_login</w:t>
-      </w:r>
-      <w:r>
-        <w:t>的</w:t>
-      </w:r>
-      <w:r>
-        <w:t>Ansible Role</w:t>
-      </w:r>
-      <w:r>
-        <w:t>实现登录鉴权。具体例子如下：</w:t>
-      </w:r>
-    </w:p>
-    <w:tbl>
-      <w:tblPr>
-        <w:tblW w:w="0" w:type="auto"/>
-        <w:tblInd w:w="1701" w:type="dxa"/>
-        <w:tblBorders>
-          <w:top w:val="single" w:sz="4" w:space="0" w:color="auto"/>
-          <w:left w:val="single" w:sz="4" w:space="0" w:color="auto"/>
-          <w:bottom w:val="single" w:sz="4" w:space="0" w:color="auto"/>
-          <w:right w:val="single" w:sz="4" w:space="0" w:color="auto"/>
-          <w:insideH w:val="single" w:sz="4" w:space="0" w:color="auto"/>
-          <w:insideV w:val="single" w:sz="4" w:space="0" w:color="auto"/>
-        </w:tblBorders>
-        <w:tblLook w:val="04A0" w:firstRow="1" w:lastRow="0" w:firstColumn="1" w:lastColumn="0" w:noHBand="0" w:noVBand="1"/>
-      </w:tblPr>
-      <w:tblGrid>
-        <w:gridCol w:w="8154"/>
-      </w:tblGrid>
-      <w:tr>
-        <w:tc>
-          <w:tcPr>
-            <w:tcW w:w="9855" w:type="dxa"/>
-          </w:tcPr>
-          <w:p>
-            <w:pPr>
-              <w:widowControl w:val="0"/>
-              <w:ind w:left="0"/>
-              <w:jc w:val="both"/>
-              <w:rPr>
-                <w:rFonts w:hint="default"/>
-              </w:rPr>
-            </w:pPr>
-            <w:r>
-              <w:rPr>
-                <w:rFonts w:hint="default"/>
-              </w:rPr>
-              <w:t>- name: Test login and set environment variables globally</w:t>
-            </w:r>
-          </w:p>
-          <w:p>
-            <w:pPr>
-              <w:widowControl w:val="0"/>
-              <w:ind w:left="0"/>
-              <w:jc w:val="both"/>
-              <w:rPr>
-                <w:rFonts w:hint="default"/>
-              </w:rPr>
-            </w:pPr>
-            <w:r>
-              <w:rPr>
-                <w:rFonts w:hint="default"/>
-              </w:rPr>
-              <w:t xml:space="preserve">  hosts: localhost</w:t>
-            </w:r>
-          </w:p>
-          <w:p>
-            <w:pPr>
-              <w:widowControl w:val="0"/>
-              <w:ind w:left="0"/>
-              <w:jc w:val="both"/>
-              <w:rPr>
-                <w:rFonts w:hint="default"/>
-              </w:rPr>
-            </w:pPr>
-            <w:r>
-              <w:rPr>
-                <w:rFonts w:hint="default"/>
-              </w:rPr>
-              <w:t xml:space="preserve">  vars_files:</w:t>
-            </w:r>
-          </w:p>
-          <w:p>
-            <w:pPr>
-              <w:widowControl w:val="0"/>
-              <w:ind w:left="0"/>
-              <w:jc w:val="both"/>
-              <w:rPr>
-                <w:rFonts w:hint="default"/>
-              </w:rPr>
-            </w:pPr>
-            <w:r>
-              <w:rPr>
-                <w:rFonts w:hint="default"/>
-              </w:rPr>
-              <w:t xml:space="preserve">    - ./commons.yml</w:t>
-            </w:r>
-          </w:p>
-          <w:p>
-            <w:pPr>
-              <w:widowControl w:val="0"/>
-              <w:ind w:left="0"/>
-              <w:jc w:val="both"/>
-              <w:rPr>
-                <w:rFonts w:hint="default"/>
-              </w:rPr>
-            </w:pPr>
-            <w:r>
-              <w:rPr>
-                <w:rFonts w:hint="default"/>
-              </w:rPr>
-              <w:t xml:space="preserve">  environment:</w:t>
-            </w:r>
-          </w:p>
-          <w:p>
-            <w:pPr>
-              <w:widowControl w:val="0"/>
-              <w:ind w:left="0"/>
-              <w:jc w:val="both"/>
-              <w:rPr>
-                <w:rFonts w:hint="default"/>
-              </w:rPr>
-            </w:pPr>
-            <w:r>
-              <w:rPr>
-                <w:rFonts w:hint="default"/>
-              </w:rPr>
-              <w:t xml:space="preserve">    FUSIONCOMPUTE_HOST: '{{ fc_hostname }}'</w:t>
-            </w:r>
-          </w:p>
-          <w:p>
-            <w:pPr>
-              <w:widowControl w:val="0"/>
-              <w:ind w:left="0"/>
-              <w:jc w:val="both"/>
-              <w:rPr>
-                <w:rFonts w:hint="default"/>
-              </w:rPr>
-            </w:pPr>
-            <w:r>
-              <w:rPr>
-                <w:rFonts w:hint="default"/>
-              </w:rPr>
-              <w:t xml:space="preserve">    FUSIONCOMPUTE_USERNAME: '{{ fc_username }}'</w:t>
-            </w:r>
-          </w:p>
-          <w:p>
-            <w:pPr>
-              <w:widowControl w:val="0"/>
-              <w:ind w:left="0"/>
-              <w:jc w:val="both"/>
-              <w:rPr>
-                <w:rFonts w:hint="default"/>
-              </w:rPr>
-            </w:pPr>
-            <w:r>
-              <w:rPr>
-                <w:rFonts w:hint="default"/>
-              </w:rPr>
-              <w:t xml:space="preserve">    FUSIONCOMPUTE_PASSWORD: '{{ fc_password }}'</w:t>
-            </w:r>
-          </w:p>
-          <w:p>
-            <w:pPr>
-              <w:widowControl w:val="0"/>
-              <w:ind w:left="0"/>
-              <w:jc w:val="both"/>
-              <w:rPr>
-                <w:rFonts w:hint="default"/>
-              </w:rPr>
-            </w:pPr>
-            <w:r>
-              <w:rPr>
-                <w:rFonts w:hint="default"/>
-              </w:rPr>
-              <w:t xml:space="preserve">    FUSIONCOMPUTE_VERIFY: '{{ fc_verify }}'</w:t>
-            </w:r>
-          </w:p>
-          <w:p>
-            <w:pPr>
-              <w:widowControl w:val="0"/>
-              <w:ind w:left="0"/>
-              <w:jc w:val="both"/>
-              <w:rPr>
-                <w:rFonts w:hint="default"/>
-              </w:rPr>
-            </w:pPr>
-            <w:r>
-              <w:rPr>
-                <w:rFonts w:hint="default"/>
-              </w:rPr>
-              <w:t xml:space="preserve">  roles:</w:t>
-            </w:r>
-          </w:p>
-          <w:p>
-            <w:pPr>
-              <w:widowControl w:val="0"/>
-              <w:ind w:left="0"/>
-              <w:jc w:val="both"/>
-              <w:rPr>
-                <w:rFonts w:hint="default"/>
-              </w:rPr>
-            </w:pPr>
-            <w:r>
-              <w:rPr>
-                <w:rFonts w:hint="default"/>
-              </w:rPr>
-              <w:t xml:space="preserve">    - fc_login  # The role will set fc_token and fc_site_id</w:t>
-            </w:r>
-          </w:p>
-          <w:p>
-            <w:pPr>
-              <w:widowControl w:val="0"/>
-              <w:ind w:left="0"/>
-              <w:jc w:val="both"/>
-              <w:rPr>
-                <w:rFonts w:hint="default"/>
-              </w:rPr>
-            </w:pPr>
-            <w:r>
-              <w:rPr>
-                <w:rFonts w:hint="default"/>
-              </w:rPr>
-              <w:t xml:space="preserve">  tasks:</w:t>
-            </w:r>
-          </w:p>
-          <w:p>
-            <w:pPr>
-              <w:widowControl w:val="0"/>
-              <w:ind w:left="0"/>
-              <w:jc w:val="both"/>
-              <w:rPr>
-                <w:rFonts w:hint="default"/>
-              </w:rPr>
-            </w:pPr>
-            <w:r>
-              <w:rPr>
-                <w:rFonts w:hint="default"/>
-              </w:rPr>
-              <w:t xml:space="preserve">    - name: Dump test output (to verify token)</w:t>
-            </w:r>
-          </w:p>
-          <w:p>
-            <w:pPr>
-              <w:widowControl w:val="0"/>
-              <w:ind w:left="0"/>
-              <w:jc w:val="both"/>
-              <w:rPr>
-                <w:rFonts w:hint="default"/>
-              </w:rPr>
-            </w:pPr>
-            <w:r>
-              <w:rPr>
-                <w:rFonts w:hint="default"/>
-              </w:rPr>
-              <w:t xml:space="preserve">      debug:</w:t>
-            </w:r>
-          </w:p>
-          <w:p>
-            <w:pPr>
-              <w:widowControl w:val="0"/>
-              <w:ind w:left="0"/>
-              <w:jc w:val="both"/>
-              <w:rPr>
-                <w:rFonts w:hint="default"/>
-              </w:rPr>
-            </w:pPr>
-            <w:r>
-              <w:rPr>
-                <w:rFonts w:hint="default"/>
-              </w:rPr>
-              <w:lastRenderedPageBreak/>
-              <w:t xml:space="preserve">        msg: '{{ fc_token }}'</w:t>
-            </w:r>
-          </w:p>
-          <w:p>
-            <w:pPr>
-              <w:widowControl w:val="0"/>
-              <w:ind w:left="0"/>
-              <w:jc w:val="both"/>
-              <w:rPr>
-                <w:rFonts w:hint="default"/>
-              </w:rPr>
-            </w:pPr>
-          </w:p>
-          <w:p>
-            <w:pPr>
-              <w:widowControl w:val="0"/>
-              <w:ind w:left="0"/>
-              <w:jc w:val="both"/>
-              <w:rPr>
-                <w:rFonts w:hint="default"/>
-              </w:rPr>
-            </w:pPr>
-            <w:r>
-              <w:rPr>
-                <w:rFonts w:hint="default"/>
-              </w:rPr>
-              <w:t xml:space="preserve">    - name: Dump site ID (to verify site id)</w:t>
-            </w:r>
-          </w:p>
-          <w:p>
-            <w:pPr>
-              <w:widowControl w:val="0"/>
-              <w:ind w:left="0"/>
-              <w:jc w:val="both"/>
-              <w:rPr>
-                <w:rFonts w:hint="default"/>
-              </w:rPr>
-            </w:pPr>
-            <w:r>
-              <w:rPr>
-                <w:rFonts w:hint="default"/>
-              </w:rPr>
-              <w:t xml:space="preserve">      debug:</w:t>
-            </w:r>
-          </w:p>
-          <w:p>
-            <w:pPr>
-              <w:widowControl w:val="0"/>
-              <w:ind w:left="0"/>
-              <w:jc w:val="both"/>
-              <w:rPr>
-                <w:rFonts w:hint="default"/>
-              </w:rPr>
-            </w:pPr>
-            <w:r>
-              <w:rPr>
-                <w:rFonts w:hint="default"/>
-              </w:rPr>
-              <w:t xml:space="preserve">        msg: '{{ fc_site_id }}'</w:t>
-            </w:r>
-          </w:p>
-          <w:p>
-            <w:pPr>
-              <w:widowControl w:val="0"/>
-              <w:ind w:left="0"/>
-              <w:jc w:val="both"/>
-              <w:rPr>
-                <w:rFonts w:hint="default"/>
-              </w:rPr>
-            </w:pPr>
-          </w:p>
-          <w:p>
-            <w:pPr>
-              <w:widowControl w:val="0"/>
-              <w:ind w:left="0"/>
-              <w:jc w:val="both"/>
-              <w:rPr>
-                <w:rFonts w:hint="default"/>
-              </w:rPr>
-            </w:pPr>
-            <w:r>
-              <w:rPr>
-                <w:rFonts w:hint="default"/>
-              </w:rPr>
-              <w:t xml:space="preserve">    - name: Assert token length</w:t>
-            </w:r>
-          </w:p>
-          <w:p>
-            <w:pPr>
-              <w:widowControl w:val="0"/>
-              <w:ind w:left="0"/>
-              <w:jc w:val="both"/>
-              <w:rPr>
-                <w:rFonts w:hint="default"/>
-              </w:rPr>
-            </w:pPr>
-            <w:r>
-              <w:rPr>
-                <w:rFonts w:hint="default"/>
-              </w:rPr>
-              <w:t xml:space="preserve">      assert:</w:t>
-            </w:r>
-          </w:p>
-          <w:p>
-            <w:pPr>
-              <w:widowControl w:val="0"/>
-              <w:ind w:left="0"/>
-              <w:jc w:val="both"/>
-              <w:rPr>
-                <w:rFonts w:hint="default"/>
-              </w:rPr>
-            </w:pPr>
-            <w:r>
-              <w:rPr>
-                <w:rFonts w:hint="default"/>
-              </w:rPr>
-              <w:t xml:space="preserve">        that:</w:t>
-            </w:r>
-          </w:p>
-          <w:p>
-            <w:pPr>
-              <w:widowControl w:val="0"/>
-              <w:ind w:left="0"/>
-              <w:jc w:val="both"/>
-              <w:rPr>
-                <w:rFonts w:hint="default"/>
-              </w:rPr>
-            </w:pPr>
-            <w:r>
-              <w:rPr>
-                <w:rFonts w:hint="default"/>
-              </w:rPr>
-              <w:t xml:space="preserve">          - fc_token | length &gt; 20</w:t>
-            </w:r>
-          </w:p>
-          <w:p>
-            <w:pPr>
-              <w:widowControl w:val="0"/>
-              <w:ind w:left="0"/>
-              <w:jc w:val="both"/>
-              <w:rPr>
-                <w:rFonts w:hint="default"/>
-              </w:rPr>
-            </w:pPr>
-            <w:r>
-              <w:rPr>
-                <w:rFonts w:hint="default"/>
-              </w:rPr>
-              <w:t xml:space="preserve">        success_msg: "Got auth token!"</w:t>
-            </w:r>
-          </w:p>
-          <w:p>
-            <w:pPr>
-              <w:widowControl w:val="0"/>
-              <w:ind w:left="0"/>
-              <w:jc w:val="both"/>
-              <w:rPr>
-                <w:rFonts w:hint="default"/>
-              </w:rPr>
-            </w:pPr>
-            <w:r>
-              <w:rPr>
-                <w:rFonts w:hint="default"/>
-              </w:rPr>
-              <w:t xml:space="preserve">        fail_msg: "No auth token!"</w:t>
-            </w:r>
-          </w:p>
-        </w:tc>
-      </w:tr>
-    </w:tbl>
-    <w:p>
-      <w:pPr>
-        <w:rPr>
-          <w:rFonts w:hint="default"/>
-        </w:rPr>
-      </w:pPr>
-    </w:p>
-    <w:p>
-      <w:pPr>
-        <w:pStyle w:val="NotesHeading"/>
-        <w:tabs>
-          <w:tab w:val="left" w:pos="2100"/>
-        </w:tabs>
-        <w:rPr>
-          <w:rFonts w:hint="default"/>
-        </w:rPr>
-      </w:pPr>
-      <w:r>
-        <w:pict w14:anchorId="5853E9A8">
-          <v:shapetype id="_x0000_t75" coordsize="21600,21600" o:spt="75" o:preferrelative="t" path="m@4@5l@4@11@9@11@9@5xe" filled="f" stroked="f">
-            <v:stroke joinstyle="miter"/>
-            <v:formulas>
-              <v:f eqn="if lineDrawn pixelLineWidth 0"/>
-              <v:f eqn="sum @0 1 0"/>
-              <v:f eqn="sum 0 0 @1"/>
-              <v:f eqn="prod @2 1 2"/>
-              <v:f eqn="prod @3 21600 pixelWidth"/>
-              <v:f eqn="prod @3 21600 pixelHeight"/>
-              <v:f eqn="sum @0 0 1"/>
-              <v:f eqn="prod @6 1 2"/>
-              <v:f eqn="prod @7 21600 pixelWidth"/>
-              <v:f eqn="sum @8 21600 0"/>
-              <v:f eqn="prod @7 21600 pixelHeight"/>
-              <v:f eqn="sum @10 21600 0"/>
-            </v:formulas>
-            <v:path o:extrusionok="f" gradientshapeok="t" o:connecttype="rect"/>
-            <o:lock v:ext="edit" aspectratio="t"/>
-          </v:shapetype>
-          <v:shape id="_x0000_i1028" type="#_x0000_t75" style="width:50.15pt;height:19.15pt;visibility:visible;mso-wrap-style:square">
-            <v:imagedata r:id="rId7" o:title=""/>
-            <o:lock v:ext="edit" rotation="t" cropping="t" verticies="t"/>
-          </v:shape>
-        </w:pict>
-      </w:r>
-    </w:p>
-    <w:p>
-      <w:pPr>
-        <w:pStyle w:val="NotesText"/>
-        <w:rPr>
-          <w:rFonts w:hint="default"/>
-        </w:rPr>
-      </w:pPr>
-      <w:r>
-        <w:t>敏感信息不建议明文存储，可以使用</w:t>
-      </w:r>
-      <w:r>
-        <w:t>ansible-vault</w:t>
-      </w:r>
-      <w:r>
-        <w:t>命令创建和存储敏感信息，具体教程见官方文档：</w:t>
-      </w:r>
-      <w:r>
-        <w:t>https://docs.ansible.com/ansible/latest/vault_guide/index.html</w:t>
-      </w:r>
-    </w:p>
-    <w:p>
-      <w:pPr>
-        <w:rPr>
-          <w:rFonts w:hint="default"/>
-        </w:rPr>
-      </w:pPr>
-    </w:p>
-    <w:p>
-      <w:pPr>
-        <w:pStyle w:val="CAUTIONHeading"/>
-        <w:rPr>
-          <w:rFonts w:hint="default"/>
-        </w:rPr>
-      </w:pPr>
-      <w:r>
-        <w:pict w14:anchorId="60234433">
-          <v:shape id="图片 4" o:spid="_x0000_i1027" type="#_x0000_t75" style="width:50.15pt;height:19.15pt;visibility:visible;mso-wrap-style:square">
-            <v:imagedata r:id="rId8" o:title=""/>
-            <o:lock v:ext="edit" rotation="t" cropping="t" verticies="t"/>
-          </v:shape>
-        </w:pict>
-      </w:r>
-    </w:p>
-    <w:p>
-      <w:pPr>
-        <w:pStyle w:val="CAUTIONText"/>
-        <w:rPr>
-          <w:rFonts w:hint="default"/>
-        </w:rPr>
-      </w:pPr>
-      <w:r>
-        <w:t>ansible-vault</w:t>
-      </w:r>
-      <w:r>
-        <w:t>密码建议采用强密码，长度不低于</w:t>
-      </w:r>
-      <w:r>
-        <w:t>10</w:t>
-      </w:r>
-      <w:r>
-        <w:t>位，不建议纯英文字母和数字。</w:t>
       </w:r>
     </w:p>
     <w:p>
@@ -1290,493 +229,39 @@
       </w:r>
     </w:p>
     <w:p>
-      <w:pPr>
+      <w:r>
+        <w:t>实例鉴权例子请参考</w:t>
+      </w:r>
+      <w:r>
+        <w:t>章节</w:t>
+      </w:r>
+      <w:r>
+        <w:t>“</w:t>
+      </w:r>
+      <w:r>
+        <w:t>2</w:t>
+      </w:r>
+      <w:r>
         <w:rPr>
           <w:rFonts w:hint="default"/>
         </w:rPr>
-      </w:pPr>
+        <w:t>.1 Ansible Playbook</w:t>
+      </w:r>
       <w:r>
-        <w:t>示例：</w:t>
+        <w:t>代码示例”中代码文件</w:t>
       </w:r>
-    </w:p>
-    <w:tbl>
-      <w:tblPr>
-        <w:tblW w:w="0" w:type="auto"/>
-        <w:tblInd w:w="1701" w:type="dxa"/>
-        <w:tblBorders>
-          <w:top w:val="single" w:sz="4" w:space="0" w:color="auto"/>
-          <w:left w:val="single" w:sz="4" w:space="0" w:color="auto"/>
-          <w:bottom w:val="single" w:sz="4" w:space="0" w:color="auto"/>
-          <w:right w:val="single" w:sz="4" w:space="0" w:color="auto"/>
-          <w:insideH w:val="single" w:sz="4" w:space="0" w:color="auto"/>
-          <w:insideV w:val="single" w:sz="4" w:space="0" w:color="auto"/>
-        </w:tblBorders>
-        <w:tblLook w:val="04A0" w:firstRow="1" w:lastRow="0" w:firstColumn="1" w:lastColumn="0" w:noHBand="0" w:noVBand="1"/>
-      </w:tblPr>
-      <w:tblGrid>
-        <w:gridCol w:w="8154"/>
-      </w:tblGrid>
-      <w:tr>
-        <w:tc>
-          <w:tcPr>
-            <w:tcW w:w="9855" w:type="dxa"/>
-          </w:tcPr>
-          <w:p>
-            <w:pPr>
-              <w:widowControl w:val="0"/>
-              <w:ind w:left="0"/>
-              <w:jc w:val="both"/>
-              <w:rPr>
-                <w:rFonts w:hint="default"/>
-              </w:rPr>
-            </w:pPr>
-            <w:r>
-              <w:rPr>
-                <w:rFonts w:hint="default"/>
-              </w:rPr>
-              <w:t>- name: Test completing task</w:t>
-            </w:r>
-          </w:p>
-          <w:p>
-            <w:pPr>
-              <w:widowControl w:val="0"/>
-              <w:ind w:left="0"/>
-              <w:jc w:val="both"/>
-              <w:rPr>
-                <w:rFonts w:hint="default"/>
-              </w:rPr>
-            </w:pPr>
-            <w:r>
-              <w:rPr>
-                <w:rFonts w:hint="default"/>
-              </w:rPr>
-              <w:t xml:space="preserve">  hosts: localhost</w:t>
-            </w:r>
-          </w:p>
-          <w:p>
-            <w:pPr>
-              <w:widowControl w:val="0"/>
-              <w:ind w:left="0"/>
-              <w:jc w:val="both"/>
-              <w:rPr>
-                <w:rFonts w:hint="default"/>
-              </w:rPr>
-            </w:pPr>
-            <w:r>
-              <w:rPr>
-                <w:rFonts w:hint="default"/>
-              </w:rPr>
-              <w:t xml:space="preserve">  vars_files:</w:t>
-            </w:r>
-          </w:p>
-          <w:p>
-            <w:pPr>
-              <w:widowControl w:val="0"/>
-              <w:ind w:left="0"/>
-              <w:jc w:val="both"/>
-              <w:rPr>
-                <w:rFonts w:hint="default"/>
-              </w:rPr>
-            </w:pPr>
-            <w:r>
-              <w:rPr>
-                <w:rFonts w:hint="default"/>
-              </w:rPr>
-              <w:t xml:space="preserve">    - ./commons.yml</w:t>
-            </w:r>
-          </w:p>
-          <w:p>
-            <w:pPr>
-              <w:widowControl w:val="0"/>
-              <w:ind w:left="0"/>
-              <w:jc w:val="both"/>
-              <w:rPr>
-                <w:rFonts w:hint="default"/>
-              </w:rPr>
-            </w:pPr>
-            <w:r>
-              <w:rPr>
-                <w:rFonts w:hint="default"/>
-              </w:rPr>
-              <w:t xml:space="preserve">  vars:</w:t>
-            </w:r>
-          </w:p>
-          <w:p>
-            <w:pPr>
-              <w:widowControl w:val="0"/>
-              <w:ind w:left="0"/>
-              <w:jc w:val="both"/>
-              <w:rPr>
-                <w:rFonts w:hint="default"/>
-              </w:rPr>
-            </w:pPr>
-            <w:r>
-              <w:rPr>
-                <w:rFonts w:hint="default"/>
-              </w:rPr>
-              <w:t xml:space="preserve">    action: 'complete'</w:t>
-            </w:r>
-          </w:p>
-          <w:p>
-            <w:pPr>
-              <w:widowControl w:val="0"/>
-              <w:ind w:left="0"/>
-              <w:jc w:val="both"/>
-              <w:rPr>
-                <w:rFonts w:hint="default"/>
-              </w:rPr>
-            </w:pPr>
-            <w:r>
-              <w:rPr>
-                <w:rFonts w:hint="default"/>
-              </w:rPr>
-              <w:t xml:space="preserve">    task_id: '1427'</w:t>
-            </w:r>
-          </w:p>
-          <w:p>
-            <w:pPr>
-              <w:widowControl w:val="0"/>
-              <w:ind w:left="0"/>
-              <w:jc w:val="both"/>
-              <w:rPr>
-                <w:rFonts w:hint="default"/>
-              </w:rPr>
-            </w:pPr>
-            <w:r>
-              <w:rPr>
-                <w:rFonts w:hint="default"/>
-              </w:rPr>
-              <w:lastRenderedPageBreak/>
-              <w:t xml:space="preserve">    fc_wait_timeout: 10</w:t>
-            </w:r>
-          </w:p>
-          <w:p>
-            <w:pPr>
-              <w:widowControl w:val="0"/>
-              <w:ind w:left="0"/>
-              <w:jc w:val="both"/>
-              <w:rPr>
-                <w:rFonts w:hint="default"/>
-              </w:rPr>
-            </w:pPr>
-            <w:r>
-              <w:rPr>
-                <w:rFonts w:hint="default"/>
-              </w:rPr>
-              <w:t xml:space="preserve">    fc_pull_interval: 2</w:t>
-            </w:r>
-          </w:p>
-          <w:p>
-            <w:pPr>
-              <w:widowControl w:val="0"/>
-              <w:ind w:left="0"/>
-              <w:jc w:val="both"/>
-              <w:rPr>
-                <w:rFonts w:hint="default"/>
-              </w:rPr>
-            </w:pPr>
-          </w:p>
-          <w:p>
-            <w:pPr>
-              <w:widowControl w:val="0"/>
-              <w:ind w:left="0"/>
-              <w:jc w:val="both"/>
-              <w:rPr>
-                <w:rFonts w:hint="default"/>
-              </w:rPr>
-            </w:pPr>
-            <w:r>
-              <w:rPr>
-                <w:rFonts w:hint="default"/>
-              </w:rPr>
-              <w:t xml:space="preserve">  tasks:</w:t>
-            </w:r>
-          </w:p>
-          <w:p>
-            <w:pPr>
-              <w:widowControl w:val="0"/>
-              <w:ind w:left="0"/>
-              <w:jc w:val="both"/>
-              <w:rPr>
-                <w:rFonts w:hint="default"/>
-              </w:rPr>
-            </w:pPr>
-            <w:r>
-              <w:rPr>
-                <w:rFonts w:hint="default"/>
-              </w:rPr>
-              <w:t xml:space="preserve">    - name: Retrieve authentication token and task status</w:t>
-            </w:r>
-          </w:p>
-          <w:p>
-            <w:pPr>
-              <w:widowControl w:val="0"/>
-              <w:ind w:left="0"/>
-              <w:jc w:val="both"/>
-              <w:rPr>
-                <w:rFonts w:hint="default"/>
-              </w:rPr>
-            </w:pPr>
-            <w:r>
-              <w:rPr>
-                <w:rFonts w:hint="default"/>
-              </w:rPr>
-              <w:t xml:space="preserve">      huawei.fusioncompute.fc_task_manager:</w:t>
-            </w:r>
-          </w:p>
-          <w:p>
-            <w:pPr>
-              <w:widowControl w:val="0"/>
-              <w:ind w:left="0"/>
-              <w:jc w:val="both"/>
-              <w:rPr>
-                <w:rFonts w:hint="default"/>
-              </w:rPr>
-            </w:pPr>
-            <w:r>
-              <w:rPr>
-                <w:rFonts w:hint="default"/>
-              </w:rPr>
-              <w:t xml:space="preserve">        fc_hostname: '{{ fc_hostname }}'</w:t>
-            </w:r>
-          </w:p>
-          <w:p>
-            <w:pPr>
-              <w:widowControl w:val="0"/>
-              <w:ind w:left="0"/>
-              <w:jc w:val="both"/>
-              <w:rPr>
-                <w:rFonts w:hint="default"/>
-              </w:rPr>
-            </w:pPr>
-            <w:r>
-              <w:rPr>
-                <w:rFonts w:hint="default"/>
-              </w:rPr>
-              <w:t xml:space="preserve">        fc_username: '{{ fc_username }}'</w:t>
-            </w:r>
-          </w:p>
-          <w:p>
-            <w:pPr>
-              <w:widowControl w:val="0"/>
-              <w:ind w:left="0"/>
-              <w:jc w:val="both"/>
-              <w:rPr>
-                <w:rFonts w:hint="default"/>
-              </w:rPr>
-            </w:pPr>
-            <w:r>
-              <w:rPr>
-                <w:rFonts w:hint="default"/>
-              </w:rPr>
-              <w:t xml:space="preserve">        fc_password: '{{ fc_password }}'</w:t>
-            </w:r>
-          </w:p>
-          <w:p>
-            <w:pPr>
-              <w:widowControl w:val="0"/>
-              <w:ind w:left="0"/>
-              <w:jc w:val="both"/>
-              <w:rPr>
-                <w:rFonts w:hint="default"/>
-              </w:rPr>
-            </w:pPr>
-            <w:r>
-              <w:rPr>
-                <w:rFonts w:hint="default"/>
-              </w:rPr>
-              <w:t xml:space="preserve">        action: '{{action}}'</w:t>
-            </w:r>
-          </w:p>
-          <w:p>
-            <w:pPr>
-              <w:widowControl w:val="0"/>
-              <w:ind w:left="0"/>
-              <w:jc w:val="both"/>
-              <w:rPr>
-                <w:rFonts w:hint="default"/>
-              </w:rPr>
-            </w:pPr>
-            <w:r>
-              <w:rPr>
-                <w:rFonts w:hint="default"/>
-              </w:rPr>
-              <w:t xml:space="preserve">        task_id: '{{task_id}}'</w:t>
-            </w:r>
-          </w:p>
-          <w:p>
-            <w:pPr>
-              <w:widowControl w:val="0"/>
-              <w:ind w:left="0"/>
-              <w:jc w:val="both"/>
-              <w:rPr>
-                <w:rFonts w:hint="default"/>
-              </w:rPr>
-            </w:pPr>
-            <w:r>
-              <w:rPr>
-                <w:rFonts w:hint="default"/>
-              </w:rPr>
-              <w:t xml:space="preserve">        fc_wait_timeout: '{{fc_wait_timeout}}'</w:t>
-            </w:r>
-          </w:p>
-          <w:p>
-            <w:pPr>
-              <w:widowControl w:val="0"/>
-              <w:ind w:left="0"/>
-              <w:jc w:val="both"/>
-              <w:rPr>
-                <w:rFonts w:hint="default"/>
-              </w:rPr>
-            </w:pPr>
-            <w:r>
-              <w:rPr>
-                <w:rFonts w:hint="default"/>
-              </w:rPr>
-              <w:t xml:space="preserve">        fc_pull_interval: '{{fc_pull_interval}}'</w:t>
-            </w:r>
-          </w:p>
-          <w:p>
-            <w:pPr>
-              <w:widowControl w:val="0"/>
-              <w:ind w:left="0"/>
-              <w:jc w:val="both"/>
-              <w:rPr>
-                <w:rFonts w:hint="default"/>
-              </w:rPr>
-            </w:pPr>
-            <w:r>
-              <w:rPr>
-                <w:rFonts w:hint="default"/>
-              </w:rPr>
-              <w:t xml:space="preserve">      register: output</w:t>
-            </w:r>
-          </w:p>
-          <w:p>
-            <w:pPr>
-              <w:widowControl w:val="0"/>
-              <w:ind w:left="0"/>
-              <w:jc w:val="both"/>
-              <w:rPr>
-                <w:rFonts w:hint="default"/>
-              </w:rPr>
-            </w:pPr>
-          </w:p>
-          <w:p>
-            <w:pPr>
-              <w:widowControl w:val="0"/>
-              <w:ind w:left="0"/>
-              <w:jc w:val="both"/>
-              <w:rPr>
-                <w:rFonts w:hint="default"/>
-              </w:rPr>
-            </w:pPr>
-            <w:r>
-              <w:rPr>
-                <w:rFonts w:hint="default"/>
-              </w:rPr>
-              <w:t xml:space="preserve">    - name: get test output</w:t>
-            </w:r>
-          </w:p>
-          <w:p>
-            <w:pPr>
-              <w:widowControl w:val="0"/>
-              <w:ind w:left="0"/>
-              <w:jc w:val="both"/>
-              <w:rPr>
-                <w:rFonts w:hint="default"/>
-              </w:rPr>
-            </w:pPr>
-            <w:r>
-              <w:rPr>
-                <w:rFonts w:hint="default"/>
-              </w:rPr>
-              <w:t xml:space="preserve">      set_fact:</w:t>
-            </w:r>
-          </w:p>
-          <w:p>
-            <w:pPr>
-              <w:widowControl w:val="0"/>
-              <w:ind w:left="0"/>
-              <w:jc w:val="both"/>
-              <w:rPr>
-                <w:rFonts w:hint="default"/>
-              </w:rPr>
-            </w:pPr>
-            <w:r>
-              <w:rPr>
-                <w:rFonts w:hint="default"/>
-              </w:rPr>
-              <w:t xml:space="preserve">        ret: "{{ output }}"</w:t>
-            </w:r>
-          </w:p>
-          <w:p>
-            <w:pPr>
-              <w:widowControl w:val="0"/>
-              <w:ind w:left="0"/>
-              <w:jc w:val="both"/>
-              <w:rPr>
-                <w:rFonts w:hint="default"/>
-              </w:rPr>
-            </w:pPr>
-          </w:p>
-          <w:p>
-            <w:pPr>
-              <w:widowControl w:val="0"/>
-              <w:ind w:left="0"/>
-              <w:jc w:val="both"/>
-              <w:rPr>
-                <w:rFonts w:hint="default"/>
-              </w:rPr>
-            </w:pPr>
-            <w:r>
-              <w:rPr>
-                <w:rFonts w:hint="default"/>
-              </w:rPr>
-              <w:t xml:space="preserve">    - name: dump test output</w:t>
-            </w:r>
-          </w:p>
-          <w:p>
-            <w:pPr>
-              <w:widowControl w:val="0"/>
-              <w:ind w:left="0"/>
-              <w:jc w:val="both"/>
-              <w:rPr>
-                <w:rFonts w:hint="default"/>
-              </w:rPr>
-            </w:pPr>
-            <w:r>
-              <w:rPr>
-                <w:rFonts w:hint="default"/>
-              </w:rPr>
-              <w:t xml:space="preserve">      debug:</w:t>
-            </w:r>
-          </w:p>
-          <w:p>
-            <w:pPr>
-              <w:widowControl w:val="0"/>
-              <w:ind w:left="0"/>
-              <w:jc w:val="both"/>
-              <w:rPr>
-                <w:rFonts w:hint="default"/>
-              </w:rPr>
-            </w:pPr>
-            <w:r>
-              <w:rPr>
-                <w:rFonts w:hint="default"/>
-              </w:rPr>
-              <w:t xml:space="preserve">        msg: '{{ ret }}'</w:t>
-            </w:r>
-          </w:p>
-        </w:tc>
-      </w:tr>
-    </w:tbl>
-    <w:p>
-      <w:pPr>
+      <w:r>
+        <w:t>w</w:t>
+      </w:r>
+      <w:r>
         <w:rPr>
           <w:rFonts w:hint="default"/>
         </w:rPr>
-      </w:pPr>
+        <w:t>ait_fc_system_task.yml</w:t>
+      </w:r>
+      <w:r>
+        <w:t>。</w:t>
+      </w:r>
     </w:p>
     <w:p>
       <w:pPr>
@@ -1844,8 +329,27 @@
         </w:rPr>
       </w:pPr>
       <w:r>
-        <w:pict w14:anchorId="1FE513BE">
-          <v:shape id="图片 2" o:spid="_x0000_i1026" type="#_x0000_t75" style="width:50.15pt;height:19.15pt;visibility:visible;mso-wrap-style:square">
+        <w:pict w14:anchorId="5EE49141">
+          <v:shapetype id="_x0000_t75" coordsize="21600,21600" o:spt="75" o:preferrelative="t" path="m@4@5l@4@11@9@11@9@5xe" filled="f" stroked="f">
+            <v:stroke joinstyle="miter"/>
+            <v:formulas>
+              <v:f eqn="if lineDrawn pixelLineWidth 0"/>
+              <v:f eqn="sum @0 1 0"/>
+              <v:f eqn="sum 0 0 @1"/>
+              <v:f eqn="prod @2 1 2"/>
+              <v:f eqn="prod @3 21600 pixelWidth"/>
+              <v:f eqn="prod @3 21600 pixelHeight"/>
+              <v:f eqn="sum @0 0 1"/>
+              <v:f eqn="prod @6 1 2"/>
+              <v:f eqn="prod @7 21600 pixelWidth"/>
+              <v:f eqn="sum @8 21600 0"/>
+              <v:f eqn="prod @7 21600 pixelHeight"/>
+              <v:f eqn="sum @10 21600 0"/>
+            </v:formulas>
+            <v:path o:extrusionok="f" gradientshapeok="t" o:connecttype="rect"/>
+            <o:lock v:ext="edit" aspectratio="t"/>
+          </v:shapetype>
+          <v:shape id="图片 2" o:spid="_x0000_i1026" type="#_x0000_t75" style="width:49.9pt;height:18.8pt;visibility:visible;mso-wrap-style:square">
             <v:imagedata r:id="rId7" o:title=""/>
             <o:lock v:ext="edit" rotation="t" cropping="t" verticies="t"/>
           </v:shape>
@@ -2876,8 +1380,8 @@
         </w:rPr>
       </w:pPr>
       <w:r>
-        <w:pict w14:anchorId="037AD1E3">
-          <v:shape id="图片 1" o:spid="_x0000_i1025" type="#_x0000_t75" style="width:50.15pt;height:19.15pt;visibility:visible;mso-wrap-style:square">
+        <w:pict w14:anchorId="0324AC0F">
+          <v:shape id="图片 1" o:spid="_x0000_i1025" type="#_x0000_t75" style="width:49.9pt;height:18.8pt;visibility:visible;mso-wrap-style:square">
             <v:imagedata r:id="rId7" o:title=""/>
             <o:lock v:ext="edit" rotation="t" cropping="t" verticies="t"/>
           </v:shape>
@@ -13020,13 +11524,13 @@
         <w:t>文件：</w:t>
       </w:r>
       <w:r>
-        <w:t>ansible</w:t>
+        <w:t>main</w:t>
       </w:r>
       <w:r>
         <w:rPr>
           <w:rFonts w:hint="default"/>
         </w:rPr>
-        <w:t>_example.yml</w:t>
+        <w:t>.yml</w:t>
       </w:r>
     </w:p>
     <w:tbl>
@@ -17907,7 +16411,19 @@
               <w:rPr>
                 <w:rFonts w:hint="default"/>
               </w:rPr>
-              <w:t xml:space="preserve">[root@api-test ansible]# ansible-playbook ansible_example.yml </w:t>
+              <w:t xml:space="preserve">[root@api-test ansible]# ansible-playbook </w:t>
+            </w:r>
+            <w:r>
+              <w:t>main</w:t>
+            </w:r>
+            <w:r>
+              <w:t>.</w:t>
+            </w:r>
+            <w:r>
+              <w:rPr>
+                <w:rFonts w:hint="default"/>
+              </w:rPr>
+              <w:t xml:space="preserve">yml </w:t>
             </w:r>
           </w:p>
           <w:p>
@@ -31948,10 +30464,10 @@
       </w:pPr>
     </w:p>
     <w:sectPr>
-      <w:headerReference w:type="even" r:id="rId9"/>
-      <w:headerReference w:type="default" r:id="rId10"/>
-      <w:footerReference w:type="even" r:id="rId11"/>
-      <w:footerReference w:type="default" r:id="rId12"/>
+      <w:headerReference w:type="even" r:id="rId8"/>
+      <w:headerReference w:type="default" r:id="rId9"/>
+      <w:footerReference w:type="even" r:id="rId10"/>
+      <w:footerReference w:type="default" r:id="rId11"/>
       <w:pgSz w:w="11907" w:h="16840" w:code="9"/>
       <w:pgMar w:top="1701" w:right="1134" w:bottom="1701" w:left="1134" w:header="567" w:footer="567" w:gutter="0"/>
       <w:cols w:space="425"/>

</xml_diff>